<commit_message>
Deutsch 11: Trapattoni-Brief ersetzt den Test (keine Wahl)
Co-Authored-By: Claude Opus 5.5 <noreply@anthropic.com>
Claude-Session: https://claude.ai/code/session_01Kzh1oWiqhC6W8oSNq8mKnj
</commit_message>
<xml_diff>
--- a/Deutsch_11/Trapattoni_Wutrede/Tafelscript_Trapattoni_Wutrede.docx
+++ b/Deutsch_11/Trapattoni_Wutrede/Tafelscript_Trapattoni_Wutrede.docx
@@ -1179,7 +1179,7 @@
                       <w:sz w:val="17"/>
                       <w:szCs w:val="17"/>
                     </w:rPr>
-                    <w:t xml:space="preserve">Wahl: Der Brief kann als Test gewertet werden.</w:t>
+                    <w:t xml:space="preserve">Der Brief ersetzt den angekündigten Test.</w:t>
                   </w:r>
                 </w:p>
               </w:tc>
@@ -2434,7 +2434,7 @@
                 <w:sz w:val="19"/>
                 <w:szCs w:val="19"/>
               </w:rPr>
-              <w:t xml:space="preserve">„Jetzt bringt ihr das in Ordnung.“ Hinweis: Der Brief kann als Test gewertet werden (Wahl). Kriterien siehe Seite 3.</w:t>
+              <w:t xml:space="preserve">„Jetzt bringt ihr das in Ordnung.“ Hinweis: Der Brief ersetzt den angekündigten Test und wird von allen geschrieben. Kriterien siehe Seite 3.</w:t>
             </w:r>
           </w:p>
         </w:tc>
@@ -2709,7 +2709,7 @@
                 <w:sz w:val="22"/>
                 <w:szCs w:val="22"/>
               </w:rPr>
-              <w:t xml:space="preserve">Test zur Wahl: </w:t>
+              <w:t xml:space="preserve">Leistungsnachweis: </w:t>
             </w:r>
             <w:r>
               <w:rPr>
@@ -2718,7 +2718,7 @@
                 <w:sz w:val="21"/>
                 <w:szCs w:val="21"/>
               </w:rPr>
-              <w:t xml:space="preserve">Wer möchte, gibt den Brief als Testleistung ab. Die Entscheidung fällt vor dem Schreiben (Kreuz auf dem Blatt: ☐ als Test werten).</w:t>
+              <w:t xml:space="preserve">Der Brief ersetzt den angekündigten Test über die Kommunikationsmodelle und wird von allen geschrieben und bewertet. Er prüft dasselbe – nur angewendet statt beschrieben.</w:t>
             </w:r>
           </w:p>
         </w:tc>

</xml_diff>

<commit_message>
Deutsch 11: Trapattoni-Brief – Bewertung nach Inhalt und Sprache (R/G/Z)
Co-Authored-By: Claude Opus 5.5 <noreply@anthropic.com>
Claude-Session: https://claude.ai/code/session_01Kzh1oWiqhC6W8oSNq8mKnj
</commit_message>
<xml_diff>
--- a/Deutsch_11/Trapattoni_Wutrede/Tafelscript_Trapattoni_Wutrede.docx
+++ b/Deutsch_11/Trapattoni_Wutrede/Tafelscript_Trapattoni_Wutrede.docx
@@ -1154,6 +1154,20 @@
                 </w:p>
                 <w:p>
                   <w:pPr>
+                    <w:spacing w:after="10" w:before="0"/>
+                  </w:pPr>
+                  <w:r>
+                    <w:rPr>
+                      <w:rFonts w:ascii="Calibri" w:cs="Calibri" w:eastAsia="Calibri" w:hAnsi="Calibri"/>
+                      <w:color w:val="F3F1EA"/>
+                      <w:sz w:val="17"/>
+                      <w:szCs w:val="17"/>
+                    </w:rPr>
+                    <w:t xml:space="preserve">Inhalt: alle vier Seiten „heilen“ – Ich-Botschaft · Empathie · konkrete Bitte · Metakommunikation</w:t>
+                  </w:r>
+                </w:p>
+                <w:p>
+                  <w:pPr>
                     <w:spacing w:after="20" w:before="0"/>
                   </w:pPr>
                   <w:r>
@@ -1163,7 +1177,7 @@
                       <w:sz w:val="17"/>
                       <w:szCs w:val="17"/>
                     </w:rPr>
-                    <w:t xml:space="preserve">• alle vier Seiten „heilen“  • Ich-Botschaft  • Empathie  • konkrete Bitte  • Metakommunikation</w:t>
+                    <w:t xml:space="preserve">Sprache: Briefform · Ton · Rechtschreibung · Grammatik · Zeichensetzung</w:t>
                   </w:r>
                 </w:p>
                 <w:p>
@@ -1430,7 +1444,7 @@
       <w:tr>
         <w:trPr>
           <w:cantSplit/>
-          <w:trHeight w:val="700" w:hRule="atLeast"/>
+          <w:trHeight w:val="560" w:hRule="atLeast"/>
         </w:trPr>
         <w:tc>
           <w:tcPr>
@@ -1604,7 +1618,7 @@
       <w:tr>
         <w:trPr>
           <w:cantSplit/>
-          <w:trHeight w:val="700" w:hRule="atLeast"/>
+          <w:trHeight w:val="560" w:hRule="atLeast"/>
         </w:trPr>
         <w:tc>
           <w:tcPr>
@@ -1778,7 +1792,7 @@
       <w:tr>
         <w:trPr>
           <w:cantSplit/>
-          <w:trHeight w:val="700" w:hRule="atLeast"/>
+          <w:trHeight w:val="560" w:hRule="atLeast"/>
         </w:trPr>
         <w:tc>
           <w:tcPr>
@@ -1952,7 +1966,7 @@
       <w:tr>
         <w:trPr>
           <w:cantSplit/>
-          <w:trHeight w:val="700" w:hRule="atLeast"/>
+          <w:trHeight w:val="560" w:hRule="atLeast"/>
         </w:trPr>
         <w:tc>
           <w:tcPr>
@@ -2126,7 +2140,7 @@
       <w:tr>
         <w:trPr>
           <w:cantSplit/>
-          <w:trHeight w:val="700" w:hRule="atLeast"/>
+          <w:trHeight w:val="560" w:hRule="atLeast"/>
         </w:trPr>
         <w:tc>
           <w:tcPr>
@@ -2300,7 +2314,7 @@
       <w:tr>
         <w:trPr>
           <w:cantSplit/>
-          <w:trHeight w:val="700" w:hRule="atLeast"/>
+          <w:trHeight w:val="560" w:hRule="atLeast"/>
         </w:trPr>
         <w:tc>
           <w:tcPr>
@@ -2434,7 +2448,7 @@
                 <w:sz w:val="19"/>
                 <w:szCs w:val="19"/>
               </w:rPr>
-              <w:t xml:space="preserve">„Jetzt bringt ihr das in Ordnung.“ Hinweis: Der Brief ersetzt den angekündigten Test und wird von allen geschrieben. Kriterien siehe Seite 3.</w:t>
+              <w:t xml:space="preserve">„Jetzt bringt ihr das in Ordnung.“ Der Brief ersetzt den Test. Note aus Inhalt + Sprache (inkl. Rechtschreibung, Grammatik, Zeichensetzung), Kriterien S. 3.</w:t>
             </w:r>
           </w:p>
         </w:tc>
@@ -2620,7 +2634,7 @@
     </w:p>
     <w:p>
       <w:pPr>
-        <w:spacing w:after="60" w:before="0"/>
+        <w:spacing w:after="40" w:before="0"/>
       </w:pPr>
       <w:r>
         <w:rPr>
@@ -2628,8 +2642,8 @@
           <w:b/>
           <w:bCs/>
           <w:color w:val="1E2761"/>
-          <w:sz w:val="40"/>
-          <w:szCs w:val="40"/>
+          <w:sz w:val="34"/>
+          <w:szCs w:val="34"/>
         </w:rPr>
         <w:t xml:space="preserve">„Jetzt bringt ihr das in Ordnung“ – Brief an die Spieler</w:t>
       </w:r>
@@ -2690,8 +2704,8 @@
               <w:rPr>
                 <w:rFonts w:ascii="Calibri" w:cs="Calibri" w:eastAsia="Calibri" w:hAnsi="Calibri"/>
                 <w:color w:val="000000"/>
-                <w:sz w:val="21"/>
-                <w:szCs w:val="21"/>
+                <w:sz w:val="19"/>
+                <w:szCs w:val="19"/>
               </w:rPr>
               <w:t xml:space="preserve">Schreibe als Giovanni Trapattoni einen Brief an Thomas Strunz, Mario Basler und Mehmet Scholl. Bringe die Missverständnisse aus der Pressekonferenz in Ordnung – so, dass alle vier Seiten der Nachricht wieder stimmen. Nutze die Techniken aus der letzten Stunde.</w:t>
             </w:r>
@@ -2715,10 +2729,30 @@
               <w:rPr>
                 <w:rFonts w:ascii="Calibri" w:cs="Calibri" w:eastAsia="Calibri" w:hAnsi="Calibri"/>
                 <w:color w:val="000000"/>
-                <w:sz w:val="21"/>
-                <w:szCs w:val="21"/>
-              </w:rPr>
-              <w:t xml:space="preserve">Der Brief ersetzt den angekündigten Test über die Kommunikationsmodelle und wird von allen geschrieben und bewertet. Er prüft dasselbe – nur angewendet statt beschrieben.</w:t>
+                <w:sz w:val="19"/>
+                <w:szCs w:val="19"/>
+              </w:rPr>
+              <w:t xml:space="preserve">Der Brief ersetzt den angekündigten Test und wird von allen geschrieben. </w:t>
+            </w:r>
+            <w:r>
+              <w:rPr>
+                <w:rFonts w:ascii="Calibri" w:cs="Calibri" w:eastAsia="Calibri" w:hAnsi="Calibri"/>
+                <w:b/>
+                <w:bCs/>
+                <w:color w:val="1E2761"/>
+                <w:sz w:val="22"/>
+                <w:szCs w:val="22"/>
+              </w:rPr>
+              <w:t xml:space="preserve">Gesamtnote: </w:t>
+            </w:r>
+            <w:r>
+              <w:rPr>
+                <w:rFonts w:ascii="Calibri" w:cs="Calibri" w:eastAsia="Calibri" w:hAnsi="Calibri"/>
+                <w:color w:val="000000"/>
+                <w:sz w:val="19"/>
+                <w:szCs w:val="19"/>
+              </w:rPr>
+              <w:t xml:space="preserve">Inhalt (20 P.) + Sprache (10 P.) = 30 P., Gewichtung 2 : 1 – bei anderen Fachschaftsvorgaben anpassen.</w:t>
             </w:r>
           </w:p>
         </w:tc>
@@ -2726,8 +2760,7 @@
     </w:tbl>
     <w:p>
       <w:pPr>
-        <w:keepNext/>
-        <w:spacing w:after="80" w:before="160"/>
+        <w:spacing w:after="60" w:before="80"/>
       </w:pPr>
       <w:r>
         <w:rPr>
@@ -2735,8 +2768,8 @@
           <w:b/>
           <w:bCs/>
           <w:color w:val="D9534F"/>
-          <w:sz w:val="26"/>
-          <w:szCs w:val="26"/>
+          <w:sz w:val="24"/>
+          <w:szCs w:val="24"/>
         </w:rPr>
         <w:t xml:space="preserve">✓  </w:t>
       </w:r>
@@ -2746,10 +2779,10 @@
           <w:b/>
           <w:bCs/>
           <w:color w:val="1E2761"/>
-          <w:sz w:val="26"/>
-          <w:szCs w:val="26"/>
+          <w:sz w:val="24"/>
+          <w:szCs w:val="24"/>
         </w:rPr>
-        <w:t xml:space="preserve">Bewertungskriterien</w:t>
+        <w:t xml:space="preserve">Bewertungskriterien – Inhalt und Sprache ergeben die Gesamtnote</w:t>
       </w:r>
     </w:p>
     <w:tbl>
@@ -2923,139 +2956,41 @@
       <w:tr>
         <w:trPr>
           <w:cantSplit/>
-          <w:trHeight w:val="560" w:hRule="atLeast"/>
+          <w:trHeight w:val="300" w:hRule="atLeast"/>
         </w:trPr>
         <w:tc>
           <w:tcPr>
-            <w:tcW w:type="dxa" w:w="3400"/>
-            <w:tcBorders>
-              <w:top w:val="single" w:color="B9C6E8" w:sz="6"/>
-              <w:left w:val="single" w:color="B9C6E8" w:sz="6"/>
-              <w:bottom w:val="single" w:color="B9C6E8" w:sz="6"/>
-              <w:right w:val="single" w:color="B9C6E8" w:sz="6"/>
-            </w:tcBorders>
-            <w:shd w:fill="F4F7FD" w:color="auto" w:val="clear"/>
-            <w:tcMar>
-              <w:top w:type="dxa" w:w="60"/>
-              <w:left w:type="dxa" w:w="110"/>
-              <w:bottom w:type="dxa" w:w="60"/>
-              <w:right w:type="dxa" w:w="110"/>
-            </w:tcMar>
-            <w:vAlign w:val="top"/>
-          </w:tcPr>
-          <w:p>
-            <w:pPr>
-              <w:spacing w:after="0" w:before="0"/>
-            </w:pPr>
-            <w:r>
-              <w:rPr>
-                <w:rFonts w:ascii="Calibri" w:cs="Calibri" w:eastAsia="Calibri" w:hAnsi="Calibri"/>
-                <w:b/>
-                <w:bCs/>
-                <w:color w:val="1E2761"/>
+            <w:tcW w:type="dxa" w:w="15138"/>
+            <w:gridSpan w:val="4"/>
+            <w:tcBorders>
+              <w:top w:val="single" w:color="B9C6E8" w:sz="6"/>
+              <w:left w:val="single" w:color="B9C6E8" w:sz="6"/>
+              <w:bottom w:val="single" w:color="B9C6E8" w:sz="6"/>
+              <w:right w:val="single" w:color="B9C6E8" w:sz="6"/>
+            </w:tcBorders>
+            <w:shd w:fill="5B6B8C" w:color="auto" w:val="clear"/>
+            <w:tcMar>
+              <w:top w:type="dxa" w:w="60"/>
+              <w:left w:type="dxa" w:w="110"/>
+              <w:bottom w:type="dxa" w:w="60"/>
+              <w:right w:type="dxa" w:w="110"/>
+            </w:tcMar>
+            <w:vAlign w:val="top"/>
+          </w:tcPr>
+          <w:p>
+            <w:pPr>
+              <w:spacing w:after="0" w:before="0"/>
+            </w:pPr>
+            <w:r>
+              <w:rPr>
+                <w:rFonts w:ascii="Calibri" w:cs="Calibri" w:eastAsia="Calibri" w:hAnsi="Calibri"/>
+                <w:b/>
+                <w:bCs/>
+                <w:color w:val="FFFFFF"/>
                 <w:sz w:val="20"/>
                 <w:szCs w:val="20"/>
               </w:rPr>
-              <w:t xml:space="preserve">Sachinhalt klären</w:t>
-            </w:r>
-          </w:p>
-        </w:tc>
-        <w:tc>
-          <w:tcPr>
-            <w:tcW w:type="dxa" w:w="7738"/>
-            <w:tcBorders>
-              <w:top w:val="single" w:color="B9C6E8" w:sz="6"/>
-              <w:left w:val="single" w:color="B9C6E8" w:sz="6"/>
-              <w:bottom w:val="single" w:color="B9C6E8" w:sz="6"/>
-              <w:right w:val="single" w:color="B9C6E8" w:sz="6"/>
-            </w:tcBorders>
-            <w:tcMar>
-              <w:top w:type="dxa" w:w="60"/>
-              <w:left w:type="dxa" w:w="110"/>
-              <w:bottom w:type="dxa" w:w="60"/>
-              <w:right w:type="dxa" w:w="110"/>
-            </w:tcMar>
-            <w:vAlign w:val="top"/>
-          </w:tcPr>
-          <w:p>
-            <w:pPr>
-              <w:spacing w:after="0" w:before="0"/>
-            </w:pPr>
-            <w:r>
-              <w:rPr>
-                <w:rFonts w:ascii="Calibri" w:cs="Calibri" w:eastAsia="Calibri" w:hAnsi="Calibri"/>
-                <w:color w:val="000000"/>
-                <w:sz w:val="19"/>
-                <w:szCs w:val="19"/>
-              </w:rPr>
-              <w:t xml:space="preserve">Benennt die Kritik sachlich und konkret (z. B. Defensivarbeit, Einsatz im Training) – ohne Beleidigung und ohne „Flasche leer“.</w:t>
-            </w:r>
-          </w:p>
-        </w:tc>
-        <w:tc>
-          <w:tcPr>
-            <w:tcW w:type="dxa" w:w="2000"/>
-            <w:tcBorders>
-              <w:top w:val="single" w:color="B9C6E8" w:sz="6"/>
-              <w:left w:val="single" w:color="B9C6E8" w:sz="6"/>
-              <w:bottom w:val="single" w:color="B9C6E8" w:sz="6"/>
-              <w:right w:val="single" w:color="B9C6E8" w:sz="6"/>
-            </w:tcBorders>
-            <w:tcMar>
-              <w:top w:type="dxa" w:w="60"/>
-              <w:left w:type="dxa" w:w="110"/>
-              <w:bottom w:type="dxa" w:w="60"/>
-              <w:right w:type="dxa" w:w="110"/>
-            </w:tcMar>
-            <w:vAlign w:val="center"/>
-          </w:tcPr>
-          <w:p>
-            <w:pPr>
-              <w:spacing w:after="0" w:before="0"/>
-              <w:jc w:val="center"/>
-            </w:pPr>
-            <w:r>
-              <w:rPr>
-                <w:rFonts w:ascii="Calibri" w:cs="Calibri" w:eastAsia="Calibri" w:hAnsi="Calibri"/>
-                <w:b/>
-                <w:bCs/>
-                <w:color w:val="000000"/>
-                <w:sz w:val="22"/>
-                <w:szCs w:val="22"/>
-              </w:rPr>
-              <w:t xml:space="preserve">4</w:t>
-            </w:r>
-          </w:p>
-        </w:tc>
-        <w:tc>
-          <w:tcPr>
-            <w:tcW w:type="dxa" w:w="2000"/>
-            <w:tcBorders>
-              <w:top w:val="single" w:color="B9C6E8" w:sz="6"/>
-              <w:left w:val="single" w:color="B9C6E8" w:sz="6"/>
-              <w:bottom w:val="single" w:color="B9C6E8" w:sz="6"/>
-              <w:right w:val="single" w:color="B9C6E8" w:sz="6"/>
-            </w:tcBorders>
-            <w:tcMar>
-              <w:top w:type="dxa" w:w="60"/>
-              <w:left w:type="dxa" w:w="110"/>
-              <w:bottom w:type="dxa" w:w="60"/>
-              <w:right w:type="dxa" w:w="110"/>
-            </w:tcMar>
-            <w:vAlign w:val="top"/>
-          </w:tcPr>
-          <w:p>
-            <w:pPr>
-              <w:spacing w:after="100" w:before="0"/>
-            </w:pPr>
-            <w:r>
-              <w:rPr>
-                <w:rFonts w:ascii="Calibri" w:cs="Calibri" w:eastAsia="Calibri" w:hAnsi="Calibri"/>
-                <w:color w:val="000000"/>
-                <w:sz w:val="22"/>
-                <w:szCs w:val="22"/>
-              </w:rPr>
-              <w:t xml:space="preserve"/>
+              <w:t xml:space="preserve">I  Inhalt – Anwendung des Vier-Seiten-Modells und der Techniken</w:t>
             </w:r>
           </w:p>
         </w:tc>
@@ -3063,7 +2998,7 @@
       <w:tr>
         <w:trPr>
           <w:cantSplit/>
-          <w:trHeight w:val="560" w:hRule="atLeast"/>
+          <w:trHeight w:val="280" w:hRule="atLeast"/>
         </w:trPr>
         <w:tc>
           <w:tcPr>
@@ -3076,9 +3011,9 @@
             </w:tcBorders>
             <w:shd w:fill="F4F7FD" w:color="auto" w:val="clear"/>
             <w:tcMar>
-              <w:top w:type="dxa" w:w="60"/>
-              <w:left w:type="dxa" w:w="110"/>
-              <w:bottom w:type="dxa" w:w="60"/>
+              <w:top w:type="dxa" w:w="30"/>
+              <w:left w:type="dxa" w:w="110"/>
+              <w:bottom w:type="dxa" w:w="30"/>
               <w:right w:type="dxa" w:w="110"/>
             </w:tcMar>
             <w:vAlign w:val="top"/>
@@ -3093,42 +3028,42 @@
                 <w:b/>
                 <w:bCs/>
                 <w:color w:val="1E2761"/>
-                <w:sz w:val="20"/>
-                <w:szCs w:val="20"/>
-              </w:rPr>
-              <w:t xml:space="preserve">Selbstoffenbarung ehrlich</w:t>
-            </w:r>
-          </w:p>
-        </w:tc>
-        <w:tc>
-          <w:tcPr>
-            <w:tcW w:type="dxa" w:w="7738"/>
-            <w:tcBorders>
-              <w:top w:val="single" w:color="B9C6E8" w:sz="6"/>
-              <w:left w:val="single" w:color="B9C6E8" w:sz="6"/>
-              <w:bottom w:val="single" w:color="B9C6E8" w:sz="6"/>
-              <w:right w:val="single" w:color="B9C6E8" w:sz="6"/>
-            </w:tcBorders>
-            <w:tcMar>
-              <w:top w:type="dxa" w:w="60"/>
-              <w:left w:type="dxa" w:w="110"/>
-              <w:bottom w:type="dxa" w:w="60"/>
-              <w:right w:type="dxa" w:w="110"/>
-            </w:tcMar>
-            <w:vAlign w:val="top"/>
-          </w:tcPr>
-          <w:p>
-            <w:pPr>
-              <w:spacing w:after="0" w:before="0"/>
-            </w:pPr>
-            <w:r>
-              <w:rPr>
-                <w:rFonts w:ascii="Calibri" w:cs="Calibri" w:eastAsia="Calibri" w:hAnsi="Calibri"/>
-                <w:color w:val="000000"/>
                 <w:sz w:val="19"/>
                 <w:szCs w:val="19"/>
               </w:rPr>
-              <w:t xml:space="preserve">Zeigt Frust und Enttäuschung als Ich-Botschaft („Ich war enttäuscht, als …“) statt als Wutausbruch.</w:t>
+              <w:t xml:space="preserve">Sachinhalt klären</w:t>
+            </w:r>
+          </w:p>
+        </w:tc>
+        <w:tc>
+          <w:tcPr>
+            <w:tcW w:type="dxa" w:w="7738"/>
+            <w:tcBorders>
+              <w:top w:val="single" w:color="B9C6E8" w:sz="6"/>
+              <w:left w:val="single" w:color="B9C6E8" w:sz="6"/>
+              <w:bottom w:val="single" w:color="B9C6E8" w:sz="6"/>
+              <w:right w:val="single" w:color="B9C6E8" w:sz="6"/>
+            </w:tcBorders>
+            <w:tcMar>
+              <w:top w:type="dxa" w:w="30"/>
+              <w:left w:type="dxa" w:w="110"/>
+              <w:bottom w:type="dxa" w:w="30"/>
+              <w:right w:type="dxa" w:w="110"/>
+            </w:tcMar>
+            <w:vAlign w:val="top"/>
+          </w:tcPr>
+          <w:p>
+            <w:pPr>
+              <w:spacing w:after="0" w:before="0"/>
+            </w:pPr>
+            <w:r>
+              <w:rPr>
+                <w:rFonts w:ascii="Calibri" w:cs="Calibri" w:eastAsia="Calibri" w:hAnsi="Calibri"/>
+                <w:color w:val="000000"/>
+                <w:sz w:val="17"/>
+                <w:szCs w:val="17"/>
+              </w:rPr>
+              <w:t xml:space="preserve">Benennt die Kritik sachlich und konkret (z. B. Defensivarbeit, Einsatz im Training) – ohne Beleidigung und ohne „Flasche leer“.</w:t>
             </w:r>
           </w:p>
         </w:tc>
@@ -3160,8 +3095,8 @@
                 <w:b/>
                 <w:bCs/>
                 <w:color w:val="000000"/>
-                <w:sz w:val="22"/>
-                <w:szCs w:val="22"/>
+                <w:sz w:val="21"/>
+                <w:szCs w:val="21"/>
               </w:rPr>
               <w:t xml:space="preserve">4</w:t>
             </w:r>
@@ -3203,7 +3138,7 @@
       <w:tr>
         <w:trPr>
           <w:cantSplit/>
-          <w:trHeight w:val="560" w:hRule="atLeast"/>
+          <w:trHeight w:val="280" w:hRule="atLeast"/>
         </w:trPr>
         <w:tc>
           <w:tcPr>
@@ -3216,9 +3151,9 @@
             </w:tcBorders>
             <w:shd w:fill="F4F7FD" w:color="auto" w:val="clear"/>
             <w:tcMar>
-              <w:top w:type="dxa" w:w="60"/>
-              <w:left w:type="dxa" w:w="110"/>
-              <w:bottom w:type="dxa" w:w="60"/>
+              <w:top w:type="dxa" w:w="30"/>
+              <w:left w:type="dxa" w:w="110"/>
+              <w:bottom w:type="dxa" w:w="30"/>
               <w:right w:type="dxa" w:w="110"/>
             </w:tcMar>
             <w:vAlign w:val="top"/>
@@ -3233,42 +3168,42 @@
                 <w:b/>
                 <w:bCs/>
                 <w:color w:val="1E2761"/>
-                <w:sz w:val="20"/>
-                <w:szCs w:val="20"/>
-              </w:rPr>
-              <w:t xml:space="preserve">Beziehung reparieren</w:t>
-            </w:r>
-          </w:p>
-        </w:tc>
-        <w:tc>
-          <w:tcPr>
-            <w:tcW w:type="dxa" w:w="7738"/>
-            <w:tcBorders>
-              <w:top w:val="single" w:color="B9C6E8" w:sz="6"/>
-              <w:left w:val="single" w:color="B9C6E8" w:sz="6"/>
-              <w:bottom w:val="single" w:color="B9C6E8" w:sz="6"/>
-              <w:right w:val="single" w:color="B9C6E8" w:sz="6"/>
-            </w:tcBorders>
-            <w:tcMar>
-              <w:top w:type="dxa" w:w="60"/>
-              <w:left w:type="dxa" w:w="110"/>
-              <w:bottom w:type="dxa" w:w="60"/>
-              <w:right w:type="dxa" w:w="110"/>
-            </w:tcMar>
-            <w:vAlign w:val="top"/>
-          </w:tcPr>
-          <w:p>
-            <w:pPr>
-              <w:spacing w:after="0" w:before="0"/>
-            </w:pPr>
-            <w:r>
-              <w:rPr>
-                <w:rFonts w:ascii="Calibri" w:cs="Calibri" w:eastAsia="Calibri" w:hAnsi="Calibri"/>
-                <w:color w:val="000000"/>
                 <w:sz w:val="19"/>
                 <w:szCs w:val="19"/>
               </w:rPr>
-              <w:t xml:space="preserve">Entschuldigt sich für die öffentliche Kritik, zeigt Respekt, geht auf die Sicht der Spieler ein (Empathie).</w:t>
+              <w:t xml:space="preserve">Selbstoffenbarung ehrlich</w:t>
+            </w:r>
+          </w:p>
+        </w:tc>
+        <w:tc>
+          <w:tcPr>
+            <w:tcW w:type="dxa" w:w="7738"/>
+            <w:tcBorders>
+              <w:top w:val="single" w:color="B9C6E8" w:sz="6"/>
+              <w:left w:val="single" w:color="B9C6E8" w:sz="6"/>
+              <w:bottom w:val="single" w:color="B9C6E8" w:sz="6"/>
+              <w:right w:val="single" w:color="B9C6E8" w:sz="6"/>
+            </w:tcBorders>
+            <w:tcMar>
+              <w:top w:type="dxa" w:w="30"/>
+              <w:left w:type="dxa" w:w="110"/>
+              <w:bottom w:type="dxa" w:w="30"/>
+              <w:right w:type="dxa" w:w="110"/>
+            </w:tcMar>
+            <w:vAlign w:val="top"/>
+          </w:tcPr>
+          <w:p>
+            <w:pPr>
+              <w:spacing w:after="0" w:before="0"/>
+            </w:pPr>
+            <w:r>
+              <w:rPr>
+                <w:rFonts w:ascii="Calibri" w:cs="Calibri" w:eastAsia="Calibri" w:hAnsi="Calibri"/>
+                <w:color w:val="000000"/>
+                <w:sz w:val="17"/>
+                <w:szCs w:val="17"/>
+              </w:rPr>
+              <w:t xml:space="preserve">Zeigt Frust und Enttäuschung als Ich-Botschaft („Ich war enttäuscht, als …“) statt als Wutausbruch.</w:t>
             </w:r>
           </w:p>
         </w:tc>
@@ -3300,8 +3235,8 @@
                 <w:b/>
                 <w:bCs/>
                 <w:color w:val="000000"/>
-                <w:sz w:val="22"/>
-                <w:szCs w:val="22"/>
+                <w:sz w:val="21"/>
+                <w:szCs w:val="21"/>
               </w:rPr>
               <w:t xml:space="preserve">4</w:t>
             </w:r>
@@ -3343,7 +3278,7 @@
       <w:tr>
         <w:trPr>
           <w:cantSplit/>
-          <w:trHeight w:val="560" w:hRule="atLeast"/>
+          <w:trHeight w:val="280" w:hRule="atLeast"/>
         </w:trPr>
         <w:tc>
           <w:tcPr>
@@ -3356,9 +3291,9 @@
             </w:tcBorders>
             <w:shd w:fill="F4F7FD" w:color="auto" w:val="clear"/>
             <w:tcMar>
-              <w:top w:type="dxa" w:w="60"/>
-              <w:left w:type="dxa" w:w="110"/>
-              <w:bottom w:type="dxa" w:w="60"/>
+              <w:top w:type="dxa" w:w="30"/>
+              <w:left w:type="dxa" w:w="110"/>
+              <w:bottom w:type="dxa" w:w="30"/>
               <w:right w:type="dxa" w:w="110"/>
             </w:tcMar>
             <w:vAlign w:val="top"/>
@@ -3373,42 +3308,42 @@
                 <w:b/>
                 <w:bCs/>
                 <w:color w:val="1E2761"/>
-                <w:sz w:val="20"/>
-                <w:szCs w:val="20"/>
-              </w:rPr>
-              <w:t xml:space="preserve">Appell an die Richtigen</w:t>
-            </w:r>
-          </w:p>
-        </w:tc>
-        <w:tc>
-          <w:tcPr>
-            <w:tcW w:type="dxa" w:w="7738"/>
-            <w:tcBorders>
-              <w:top w:val="single" w:color="B9C6E8" w:sz="6"/>
-              <w:left w:val="single" w:color="B9C6E8" w:sz="6"/>
-              <w:bottom w:val="single" w:color="B9C6E8" w:sz="6"/>
-              <w:right w:val="single" w:color="B9C6E8" w:sz="6"/>
-            </w:tcBorders>
-            <w:tcMar>
-              <w:top w:type="dxa" w:w="60"/>
-              <w:left w:type="dxa" w:w="110"/>
-              <w:bottom w:type="dxa" w:w="60"/>
-              <w:right w:type="dxa" w:w="110"/>
-            </w:tcMar>
-            <w:vAlign w:val="top"/>
-          </w:tcPr>
-          <w:p>
-            <w:pPr>
-              <w:spacing w:after="0" w:before="0"/>
-            </w:pPr>
-            <w:r>
-              <w:rPr>
-                <w:rFonts w:ascii="Calibri" w:cs="Calibri" w:eastAsia="Calibri" w:hAnsi="Calibri"/>
-                <w:color w:val="000000"/>
                 <w:sz w:val="19"/>
                 <w:szCs w:val="19"/>
               </w:rPr>
-              <w:t xml:space="preserve">Richtet eine konkrete, erfüllbare Bitte direkt an die Spieler (wer, was, bis wann) – z. B. Gespräch unter vier Augen, Einsatz am Samstag.</w:t>
+              <w:t xml:space="preserve">Beziehung reparieren</w:t>
+            </w:r>
+          </w:p>
+        </w:tc>
+        <w:tc>
+          <w:tcPr>
+            <w:tcW w:type="dxa" w:w="7738"/>
+            <w:tcBorders>
+              <w:top w:val="single" w:color="B9C6E8" w:sz="6"/>
+              <w:left w:val="single" w:color="B9C6E8" w:sz="6"/>
+              <w:bottom w:val="single" w:color="B9C6E8" w:sz="6"/>
+              <w:right w:val="single" w:color="B9C6E8" w:sz="6"/>
+            </w:tcBorders>
+            <w:tcMar>
+              <w:top w:type="dxa" w:w="30"/>
+              <w:left w:type="dxa" w:w="110"/>
+              <w:bottom w:type="dxa" w:w="30"/>
+              <w:right w:type="dxa" w:w="110"/>
+            </w:tcMar>
+            <w:vAlign w:val="top"/>
+          </w:tcPr>
+          <w:p>
+            <w:pPr>
+              <w:spacing w:after="0" w:before="0"/>
+            </w:pPr>
+            <w:r>
+              <w:rPr>
+                <w:rFonts w:ascii="Calibri" w:cs="Calibri" w:eastAsia="Calibri" w:hAnsi="Calibri"/>
+                <w:color w:val="000000"/>
+                <w:sz w:val="17"/>
+                <w:szCs w:val="17"/>
+              </w:rPr>
+              <w:t xml:space="preserve">Entschuldigt sich für die öffentliche Kritik, zeigt Respekt, geht auf die Sicht der Spieler ein (Empathie).</w:t>
             </w:r>
           </w:p>
         </w:tc>
@@ -3440,8 +3375,8 @@
                 <w:b/>
                 <w:bCs/>
                 <w:color w:val="000000"/>
-                <w:sz w:val="22"/>
-                <w:szCs w:val="22"/>
+                <w:sz w:val="21"/>
+                <w:szCs w:val="21"/>
               </w:rPr>
               <w:t xml:space="preserve">4</w:t>
             </w:r>
@@ -3483,7 +3418,7 @@
       <w:tr>
         <w:trPr>
           <w:cantSplit/>
-          <w:trHeight w:val="560" w:hRule="atLeast"/>
+          <w:trHeight w:val="280" w:hRule="atLeast"/>
         </w:trPr>
         <w:tc>
           <w:tcPr>
@@ -3496,9 +3431,9 @@
             </w:tcBorders>
             <w:shd w:fill="F4F7FD" w:color="auto" w:val="clear"/>
             <w:tcMar>
-              <w:top w:type="dxa" w:w="60"/>
-              <w:left w:type="dxa" w:w="110"/>
-              <w:bottom w:type="dxa" w:w="60"/>
+              <w:top w:type="dxa" w:w="30"/>
+              <w:left w:type="dxa" w:w="110"/>
+              <w:bottom w:type="dxa" w:w="30"/>
               <w:right w:type="dxa" w:w="110"/>
             </w:tcMar>
             <w:vAlign w:val="top"/>
@@ -3513,42 +3448,42 @@
                 <w:b/>
                 <w:bCs/>
                 <w:color w:val="1E2761"/>
-                <w:sz w:val="20"/>
-                <w:szCs w:val="20"/>
-              </w:rPr>
-              <w:t xml:space="preserve">Metakommunikation</w:t>
-            </w:r>
-          </w:p>
-        </w:tc>
-        <w:tc>
-          <w:tcPr>
-            <w:tcW w:type="dxa" w:w="7738"/>
-            <w:tcBorders>
-              <w:top w:val="single" w:color="B9C6E8" w:sz="6"/>
-              <w:left w:val="single" w:color="B9C6E8" w:sz="6"/>
-              <w:bottom w:val="single" w:color="B9C6E8" w:sz="6"/>
-              <w:right w:val="single" w:color="B9C6E8" w:sz="6"/>
-            </w:tcBorders>
-            <w:tcMar>
-              <w:top w:type="dxa" w:w="60"/>
-              <w:left w:type="dxa" w:w="110"/>
-              <w:bottom w:type="dxa" w:w="60"/>
-              <w:right w:type="dxa" w:w="110"/>
-            </w:tcMar>
-            <w:vAlign w:val="top"/>
-          </w:tcPr>
-          <w:p>
-            <w:pPr>
-              <w:spacing w:after="0" w:before="0"/>
-            </w:pPr>
-            <w:r>
-              <w:rPr>
-                <w:rFonts w:ascii="Calibri" w:cs="Calibri" w:eastAsia="Calibri" w:hAnsi="Calibri"/>
-                <w:color w:val="000000"/>
                 <w:sz w:val="19"/>
                 <w:szCs w:val="19"/>
               </w:rPr>
-              <w:t xml:space="preserve">Spricht über die Pressekonferenz selbst: was schiefgelaufen ist und wie man künftig miteinander redet (intern statt über die Medien).</w:t>
+              <w:t xml:space="preserve">Appell an die Richtigen</w:t>
+            </w:r>
+          </w:p>
+        </w:tc>
+        <w:tc>
+          <w:tcPr>
+            <w:tcW w:type="dxa" w:w="7738"/>
+            <w:tcBorders>
+              <w:top w:val="single" w:color="B9C6E8" w:sz="6"/>
+              <w:left w:val="single" w:color="B9C6E8" w:sz="6"/>
+              <w:bottom w:val="single" w:color="B9C6E8" w:sz="6"/>
+              <w:right w:val="single" w:color="B9C6E8" w:sz="6"/>
+            </w:tcBorders>
+            <w:tcMar>
+              <w:top w:type="dxa" w:w="30"/>
+              <w:left w:type="dxa" w:w="110"/>
+              <w:bottom w:type="dxa" w:w="30"/>
+              <w:right w:type="dxa" w:w="110"/>
+            </w:tcMar>
+            <w:vAlign w:val="top"/>
+          </w:tcPr>
+          <w:p>
+            <w:pPr>
+              <w:spacing w:after="0" w:before="0"/>
+            </w:pPr>
+            <w:r>
+              <w:rPr>
+                <w:rFonts w:ascii="Calibri" w:cs="Calibri" w:eastAsia="Calibri" w:hAnsi="Calibri"/>
+                <w:color w:val="000000"/>
+                <w:sz w:val="17"/>
+                <w:szCs w:val="17"/>
+              </w:rPr>
+              <w:t xml:space="preserve">Richtet eine konkrete, erfüllbare Bitte direkt an die Spieler (wer, was, bis wann) – z. B. Gespräch unter vier Augen, Einsatz am Samstag.</w:t>
             </w:r>
           </w:p>
         </w:tc>
@@ -3580,10 +3515,10 @@
                 <w:b/>
                 <w:bCs/>
                 <w:color w:val="000000"/>
-                <w:sz w:val="22"/>
-                <w:szCs w:val="22"/>
-              </w:rPr>
-              <w:t xml:space="preserve">2</w:t>
+                <w:sz w:val="21"/>
+                <w:szCs w:val="21"/>
+              </w:rPr>
+              <w:t xml:space="preserve">4</w:t>
             </w:r>
           </w:p>
         </w:tc>
@@ -3623,7 +3558,7 @@
       <w:tr>
         <w:trPr>
           <w:cantSplit/>
-          <w:trHeight w:val="560" w:hRule="atLeast"/>
+          <w:trHeight w:val="280" w:hRule="atLeast"/>
         </w:trPr>
         <w:tc>
           <w:tcPr>
@@ -3636,9 +3571,9 @@
             </w:tcBorders>
             <w:shd w:fill="F4F7FD" w:color="auto" w:val="clear"/>
             <w:tcMar>
-              <w:top w:type="dxa" w:w="60"/>
-              <w:left w:type="dxa" w:w="110"/>
-              <w:bottom w:type="dxa" w:w="60"/>
+              <w:top w:type="dxa" w:w="30"/>
+              <w:left w:type="dxa" w:w="110"/>
+              <w:bottom w:type="dxa" w:w="30"/>
               <w:right w:type="dxa" w:w="110"/>
             </w:tcMar>
             <w:vAlign w:val="top"/>
@@ -3653,42 +3588,42 @@
                 <w:b/>
                 <w:bCs/>
                 <w:color w:val="1E2761"/>
-                <w:sz w:val="20"/>
-                <w:szCs w:val="20"/>
-              </w:rPr>
-              <w:t xml:space="preserve">Form</w:t>
-            </w:r>
-          </w:p>
-        </w:tc>
-        <w:tc>
-          <w:tcPr>
-            <w:tcW w:type="dxa" w:w="7738"/>
-            <w:tcBorders>
-              <w:top w:val="single" w:color="B9C6E8" w:sz="6"/>
-              <w:left w:val="single" w:color="B9C6E8" w:sz="6"/>
-              <w:bottom w:val="single" w:color="B9C6E8" w:sz="6"/>
-              <w:right w:val="single" w:color="B9C6E8" w:sz="6"/>
-            </w:tcBorders>
-            <w:tcMar>
-              <w:top w:type="dxa" w:w="60"/>
-              <w:left w:type="dxa" w:w="110"/>
-              <w:bottom w:type="dxa" w:w="60"/>
-              <w:right w:type="dxa" w:w="110"/>
-            </w:tcMar>
-            <w:vAlign w:val="top"/>
-          </w:tcPr>
-          <w:p>
-            <w:pPr>
-              <w:spacing w:after="0" w:before="0"/>
-            </w:pPr>
-            <w:r>
-              <w:rPr>
-                <w:rFonts w:ascii="Calibri" w:cs="Calibri" w:eastAsia="Calibri" w:hAnsi="Calibri"/>
-                <w:color w:val="000000"/>
                 <w:sz w:val="19"/>
                 <w:szCs w:val="19"/>
               </w:rPr>
-              <w:t xml:space="preserve">Briefform (Ort, Datum, Anrede, Schluss), passender Ton, sprachlich korrekt.</w:t>
+              <w:t xml:space="preserve">Metakommunikation</w:t>
+            </w:r>
+          </w:p>
+        </w:tc>
+        <w:tc>
+          <w:tcPr>
+            <w:tcW w:type="dxa" w:w="7738"/>
+            <w:tcBorders>
+              <w:top w:val="single" w:color="B9C6E8" w:sz="6"/>
+              <w:left w:val="single" w:color="B9C6E8" w:sz="6"/>
+              <w:bottom w:val="single" w:color="B9C6E8" w:sz="6"/>
+              <w:right w:val="single" w:color="B9C6E8" w:sz="6"/>
+            </w:tcBorders>
+            <w:tcMar>
+              <w:top w:type="dxa" w:w="30"/>
+              <w:left w:type="dxa" w:w="110"/>
+              <w:bottom w:type="dxa" w:w="30"/>
+              <w:right w:type="dxa" w:w="110"/>
+            </w:tcMar>
+            <w:vAlign w:val="top"/>
+          </w:tcPr>
+          <w:p>
+            <w:pPr>
+              <w:spacing w:after="0" w:before="0"/>
+            </w:pPr>
+            <w:r>
+              <w:rPr>
+                <w:rFonts w:ascii="Calibri" w:cs="Calibri" w:eastAsia="Calibri" w:hAnsi="Calibri"/>
+                <w:color w:val="000000"/>
+                <w:sz w:val="17"/>
+                <w:szCs w:val="17"/>
+              </w:rPr>
+              <w:t xml:space="preserve">Spricht über die Pressekonferenz selbst: was schiefgelaufen ist und wie man künftig miteinander redet (intern statt über die Medien).</w:t>
             </w:r>
           </w:p>
         </w:tc>
@@ -3720,10 +3655,10 @@
                 <w:b/>
                 <w:bCs/>
                 <w:color w:val="000000"/>
-                <w:sz w:val="22"/>
-                <w:szCs w:val="22"/>
-              </w:rPr>
-              <w:t xml:space="preserve">2</w:t>
+                <w:sz w:val="21"/>
+                <w:szCs w:val="21"/>
+              </w:rPr>
+              <w:t xml:space="preserve">4</w:t>
             </w:r>
           </w:p>
         </w:tc>
@@ -3763,7 +3698,7 @@
       <w:tr>
         <w:trPr>
           <w:cantSplit/>
-          <w:trHeight w:val="460" w:hRule="atLeast"/>
+          <w:trHeight w:val="320" w:hRule="atLeast"/>
         </w:trPr>
         <w:tc>
           <w:tcPr>
@@ -3793,10 +3728,195 @@
                 <w:b/>
                 <w:bCs/>
                 <w:color w:val="1E2761"/>
+                <w:sz w:val="19"/>
+                <w:szCs w:val="19"/>
+              </w:rPr>
+              <w:t xml:space="preserve">Summe Inhalt</w:t>
+            </w:r>
+          </w:p>
+        </w:tc>
+        <w:tc>
+          <w:tcPr>
+            <w:tcW w:type="dxa" w:w="7738"/>
+            <w:tcBorders>
+              <w:top w:val="single" w:color="B9C6E8" w:sz="6"/>
+              <w:left w:val="single" w:color="B9C6E8" w:sz="6"/>
+              <w:bottom w:val="single" w:color="B9C6E8" w:sz="6"/>
+              <w:right w:val="single" w:color="B9C6E8" w:sz="6"/>
+            </w:tcBorders>
+            <w:shd w:fill="EAF0FA" w:color="auto" w:val="clear"/>
+            <w:tcMar>
+              <w:top w:type="dxa" w:w="60"/>
+              <w:left w:type="dxa" w:w="110"/>
+              <w:bottom w:type="dxa" w:w="60"/>
+              <w:right w:type="dxa" w:w="110"/>
+            </w:tcMar>
+            <w:vAlign w:val="top"/>
+          </w:tcPr>
+          <w:p>
+            <w:pPr>
+              <w:spacing w:after="100" w:before="0"/>
+            </w:pPr>
+            <w:r>
+              <w:rPr>
+                <w:rFonts w:ascii="Calibri" w:cs="Calibri" w:eastAsia="Calibri" w:hAnsi="Calibri"/>
+                <w:color w:val="000000"/>
+                <w:sz w:val="22"/>
+                <w:szCs w:val="22"/>
+              </w:rPr>
+              <w:t xml:space="preserve"/>
+            </w:r>
+          </w:p>
+        </w:tc>
+        <w:tc>
+          <w:tcPr>
+            <w:tcW w:type="dxa" w:w="2000"/>
+            <w:tcBorders>
+              <w:top w:val="single" w:color="B9C6E8" w:sz="6"/>
+              <w:left w:val="single" w:color="B9C6E8" w:sz="6"/>
+              <w:bottom w:val="single" w:color="B9C6E8" w:sz="6"/>
+              <w:right w:val="single" w:color="B9C6E8" w:sz="6"/>
+            </w:tcBorders>
+            <w:shd w:fill="EAF0FA" w:color="auto" w:val="clear"/>
+            <w:tcMar>
+              <w:top w:type="dxa" w:w="60"/>
+              <w:left w:type="dxa" w:w="110"/>
+              <w:bottom w:type="dxa" w:w="60"/>
+              <w:right w:type="dxa" w:w="110"/>
+            </w:tcMar>
+            <w:vAlign w:val="top"/>
+          </w:tcPr>
+          <w:p>
+            <w:pPr>
+              <w:spacing w:after="0" w:before="0"/>
+              <w:jc w:val="center"/>
+            </w:pPr>
+            <w:r>
+              <w:rPr>
+                <w:rFonts w:ascii="Calibri" w:cs="Calibri" w:eastAsia="Calibri" w:hAnsi="Calibri"/>
+                <w:b/>
+                <w:bCs/>
+                <w:color w:val="000000"/>
+                <w:sz w:val="21"/>
+                <w:szCs w:val="21"/>
+              </w:rPr>
+              <w:t xml:space="preserve">20</w:t>
+            </w:r>
+          </w:p>
+        </w:tc>
+        <w:tc>
+          <w:tcPr>
+            <w:tcW w:type="dxa" w:w="2000"/>
+            <w:tcBorders>
+              <w:top w:val="single" w:color="B9C6E8" w:sz="6"/>
+              <w:left w:val="single" w:color="B9C6E8" w:sz="6"/>
+              <w:bottom w:val="single" w:color="B9C6E8" w:sz="6"/>
+              <w:right w:val="single" w:color="B9C6E8" w:sz="6"/>
+            </w:tcBorders>
+            <w:shd w:fill="EAF0FA" w:color="auto" w:val="clear"/>
+            <w:tcMar>
+              <w:top w:type="dxa" w:w="60"/>
+              <w:left w:type="dxa" w:w="110"/>
+              <w:bottom w:type="dxa" w:w="60"/>
+              <w:right w:type="dxa" w:w="110"/>
+            </w:tcMar>
+            <w:vAlign w:val="top"/>
+          </w:tcPr>
+          <w:p>
+            <w:pPr>
+              <w:spacing w:after="100" w:before="0"/>
+            </w:pPr>
+            <w:r>
+              <w:rPr>
+                <w:rFonts w:ascii="Calibri" w:cs="Calibri" w:eastAsia="Calibri" w:hAnsi="Calibri"/>
+                <w:color w:val="000000"/>
+                <w:sz w:val="22"/>
+                <w:szCs w:val="22"/>
+              </w:rPr>
+              <w:t xml:space="preserve"/>
+            </w:r>
+          </w:p>
+        </w:tc>
+      </w:tr>
+      <w:tr>
+        <w:trPr>
+          <w:cantSplit/>
+          <w:trHeight w:val="300" w:hRule="atLeast"/>
+        </w:trPr>
+        <w:tc>
+          <w:tcPr>
+            <w:tcW w:type="dxa" w:w="15138"/>
+            <w:gridSpan w:val="4"/>
+            <w:tcBorders>
+              <w:top w:val="single" w:color="B9C6E8" w:sz="6"/>
+              <w:left w:val="single" w:color="B9C6E8" w:sz="6"/>
+              <w:bottom w:val="single" w:color="B9C6E8" w:sz="6"/>
+              <w:right w:val="single" w:color="B9C6E8" w:sz="6"/>
+            </w:tcBorders>
+            <w:shd w:fill="5B6B8C" w:color="auto" w:val="clear"/>
+            <w:tcMar>
+              <w:top w:type="dxa" w:w="60"/>
+              <w:left w:type="dxa" w:w="110"/>
+              <w:bottom w:type="dxa" w:w="60"/>
+              <w:right w:type="dxa" w:w="110"/>
+            </w:tcMar>
+            <w:vAlign w:val="top"/>
+          </w:tcPr>
+          <w:p>
+            <w:pPr>
+              <w:spacing w:after="0" w:before="0"/>
+            </w:pPr>
+            <w:r>
+              <w:rPr>
+                <w:rFonts w:ascii="Calibri" w:cs="Calibri" w:eastAsia="Calibri" w:hAnsi="Calibri"/>
+                <w:b/>
+                <w:bCs/>
+                <w:color w:val="FFFFFF"/>
                 <w:sz w:val="20"/>
                 <w:szCs w:val="20"/>
               </w:rPr>
-              <w:t xml:space="preserve">Gesamt</w:t>
+              <w:t xml:space="preserve">II  Sprache – Darstellung, Rechtschreibung, Grammatik, Zeichensetzung</w:t>
+            </w:r>
+          </w:p>
+        </w:tc>
+      </w:tr>
+      <w:tr>
+        <w:trPr>
+          <w:cantSplit/>
+          <w:trHeight w:val="280" w:hRule="atLeast"/>
+        </w:trPr>
+        <w:tc>
+          <w:tcPr>
+            <w:tcW w:type="dxa" w:w="3400"/>
+            <w:tcBorders>
+              <w:top w:val="single" w:color="B9C6E8" w:sz="6"/>
+              <w:left w:val="single" w:color="B9C6E8" w:sz="6"/>
+              <w:bottom w:val="single" w:color="B9C6E8" w:sz="6"/>
+              <w:right w:val="single" w:color="B9C6E8" w:sz="6"/>
+            </w:tcBorders>
+            <w:shd w:fill="F4F7FD" w:color="auto" w:val="clear"/>
+            <w:tcMar>
+              <w:top w:type="dxa" w:w="30"/>
+              <w:left w:type="dxa" w:w="110"/>
+              <w:bottom w:type="dxa" w:w="30"/>
+              <w:right w:type="dxa" w:w="110"/>
+            </w:tcMar>
+            <w:vAlign w:val="top"/>
+          </w:tcPr>
+          <w:p>
+            <w:pPr>
+              <w:spacing w:after="0" w:before="0"/>
+            </w:pPr>
+            <w:r>
+              <w:rPr>
+                <w:rFonts w:ascii="Calibri" w:cs="Calibri" w:eastAsia="Calibri" w:hAnsi="Calibri"/>
+                <w:b/>
+                <w:bCs/>
+                <w:color w:val="1E2761"/>
+                <w:sz w:val="19"/>
+                <w:szCs w:val="19"/>
+              </w:rPr>
+              <w:t xml:space="preserve">Ausdruck und Ton</w:t>
             </w:r>
           </w:p>
         </w:tc>
@@ -3809,7 +3929,73 @@
               <w:bottom w:val="single" w:color="B9C6E8" w:sz="6"/>
               <w:right w:val="single" w:color="B9C6E8" w:sz="6"/>
             </w:tcBorders>
-            <w:shd w:fill="EAF0FA" w:color="auto" w:val="clear"/>
+            <w:tcMar>
+              <w:top w:type="dxa" w:w="30"/>
+              <w:left w:type="dxa" w:w="110"/>
+              <w:bottom w:type="dxa" w:w="30"/>
+              <w:right w:type="dxa" w:w="110"/>
+            </w:tcMar>
+            <w:vAlign w:val="top"/>
+          </w:tcPr>
+          <w:p>
+            <w:pPr>
+              <w:spacing w:after="0" w:before="0"/>
+            </w:pPr>
+            <w:r>
+              <w:rPr>
+                <w:rFonts w:ascii="Calibri" w:cs="Calibri" w:eastAsia="Calibri" w:hAnsi="Calibri"/>
+                <w:color w:val="000000"/>
+                <w:sz w:val="17"/>
+                <w:szCs w:val="17"/>
+              </w:rPr>
+              <w:t xml:space="preserve">Angemessener, respektvoller Ton; treffende Wortwahl; abwechslungsreicher Satzbau.</w:t>
+            </w:r>
+          </w:p>
+        </w:tc>
+        <w:tc>
+          <w:tcPr>
+            <w:tcW w:type="dxa" w:w="2000"/>
+            <w:tcBorders>
+              <w:top w:val="single" w:color="B9C6E8" w:sz="6"/>
+              <w:left w:val="single" w:color="B9C6E8" w:sz="6"/>
+              <w:bottom w:val="single" w:color="B9C6E8" w:sz="6"/>
+              <w:right w:val="single" w:color="B9C6E8" w:sz="6"/>
+            </w:tcBorders>
+            <w:tcMar>
+              <w:top w:type="dxa" w:w="60"/>
+              <w:left w:type="dxa" w:w="110"/>
+              <w:bottom w:type="dxa" w:w="60"/>
+              <w:right w:type="dxa" w:w="110"/>
+            </w:tcMar>
+            <w:vAlign w:val="center"/>
+          </w:tcPr>
+          <w:p>
+            <w:pPr>
+              <w:spacing w:after="0" w:before="0"/>
+              <w:jc w:val="center"/>
+            </w:pPr>
+            <w:r>
+              <w:rPr>
+                <w:rFonts w:ascii="Calibri" w:cs="Calibri" w:eastAsia="Calibri" w:hAnsi="Calibri"/>
+                <w:b/>
+                <w:bCs/>
+                <w:color w:val="000000"/>
+                <w:sz w:val="21"/>
+                <w:szCs w:val="21"/>
+              </w:rPr>
+              <w:t xml:space="preserve">2</w:t>
+            </w:r>
+          </w:p>
+        </w:tc>
+        <w:tc>
+          <w:tcPr>
+            <w:tcW w:type="dxa" w:w="2000"/>
+            <w:tcBorders>
+              <w:top w:val="single" w:color="B9C6E8" w:sz="6"/>
+              <w:left w:val="single" w:color="B9C6E8" w:sz="6"/>
+              <w:bottom w:val="single" w:color="B9C6E8" w:sz="6"/>
+              <w:right w:val="single" w:color="B9C6E8" w:sz="6"/>
+            </w:tcBorders>
             <w:tcMar>
               <w:top w:type="dxa" w:w="60"/>
               <w:left w:type="dxa" w:w="110"/>
@@ -3833,6 +4019,79 @@
             </w:r>
           </w:p>
         </w:tc>
+      </w:tr>
+      <w:tr>
+        <w:trPr>
+          <w:cantSplit/>
+          <w:trHeight w:val="280" w:hRule="atLeast"/>
+        </w:trPr>
+        <w:tc>
+          <w:tcPr>
+            <w:tcW w:type="dxa" w:w="3400"/>
+            <w:tcBorders>
+              <w:top w:val="single" w:color="B9C6E8" w:sz="6"/>
+              <w:left w:val="single" w:color="B9C6E8" w:sz="6"/>
+              <w:bottom w:val="single" w:color="B9C6E8" w:sz="6"/>
+              <w:right w:val="single" w:color="B9C6E8" w:sz="6"/>
+            </w:tcBorders>
+            <w:shd w:fill="F4F7FD" w:color="auto" w:val="clear"/>
+            <w:tcMar>
+              <w:top w:type="dxa" w:w="30"/>
+              <w:left w:type="dxa" w:w="110"/>
+              <w:bottom w:type="dxa" w:w="30"/>
+              <w:right w:type="dxa" w:w="110"/>
+            </w:tcMar>
+            <w:vAlign w:val="top"/>
+          </w:tcPr>
+          <w:p>
+            <w:pPr>
+              <w:spacing w:after="0" w:before="0"/>
+            </w:pPr>
+            <w:r>
+              <w:rPr>
+                <w:rFonts w:ascii="Calibri" w:cs="Calibri" w:eastAsia="Calibri" w:hAnsi="Calibri"/>
+                <w:b/>
+                <w:bCs/>
+                <w:color w:val="1E2761"/>
+                <w:sz w:val="19"/>
+                <w:szCs w:val="19"/>
+              </w:rPr>
+              <w:t xml:space="preserve">Briefform</w:t>
+            </w:r>
+          </w:p>
+        </w:tc>
+        <w:tc>
+          <w:tcPr>
+            <w:tcW w:type="dxa" w:w="7738"/>
+            <w:tcBorders>
+              <w:top w:val="single" w:color="B9C6E8" w:sz="6"/>
+              <w:left w:val="single" w:color="B9C6E8" w:sz="6"/>
+              <w:bottom w:val="single" w:color="B9C6E8" w:sz="6"/>
+              <w:right w:val="single" w:color="B9C6E8" w:sz="6"/>
+            </w:tcBorders>
+            <w:tcMar>
+              <w:top w:type="dxa" w:w="30"/>
+              <w:left w:type="dxa" w:w="110"/>
+              <w:bottom w:type="dxa" w:w="30"/>
+              <w:right w:type="dxa" w:w="110"/>
+            </w:tcMar>
+            <w:vAlign w:val="top"/>
+          </w:tcPr>
+          <w:p>
+            <w:pPr>
+              <w:spacing w:after="0" w:before="0"/>
+            </w:pPr>
+            <w:r>
+              <w:rPr>
+                <w:rFonts w:ascii="Calibri" w:cs="Calibri" w:eastAsia="Calibri" w:hAnsi="Calibri"/>
+                <w:color w:val="000000"/>
+                <w:sz w:val="17"/>
+                <w:szCs w:val="17"/>
+              </w:rPr>
+              <w:t xml:space="preserve">Ort, Datum, Anrede, Einleitung, Schluss, Grußformel.</w:t>
+            </w:r>
+          </w:p>
+        </w:tc>
         <w:tc>
           <w:tcPr>
             <w:tcW w:type="dxa" w:w="2000"/>
@@ -3842,14 +4101,13 @@
               <w:bottom w:val="single" w:color="B9C6E8" w:sz="6"/>
               <w:right w:val="single" w:color="B9C6E8" w:sz="6"/>
             </w:tcBorders>
-            <w:shd w:fill="EAF0FA" w:color="auto" w:val="clear"/>
-            <w:tcMar>
-              <w:top w:type="dxa" w:w="60"/>
-              <w:left w:type="dxa" w:w="110"/>
-              <w:bottom w:type="dxa" w:w="60"/>
-              <w:right w:type="dxa" w:w="110"/>
-            </w:tcMar>
-            <w:vAlign w:val="top"/>
+            <w:tcMar>
+              <w:top w:type="dxa" w:w="60"/>
+              <w:left w:type="dxa" w:w="110"/>
+              <w:bottom w:type="dxa" w:w="60"/>
+              <w:right w:type="dxa" w:w="110"/>
+            </w:tcMar>
+            <w:vAlign w:val="center"/>
           </w:tcPr>
           <w:p>
             <w:pPr>
@@ -3861,11 +4119,116 @@
                 <w:rFonts w:ascii="Calibri" w:cs="Calibri" w:eastAsia="Calibri" w:hAnsi="Calibri"/>
                 <w:b/>
                 <w:bCs/>
+                <w:color w:val="000000"/>
+                <w:sz w:val="21"/>
+                <w:szCs w:val="21"/>
+              </w:rPr>
+              <w:t xml:space="preserve">2</w:t>
+            </w:r>
+          </w:p>
+        </w:tc>
+        <w:tc>
+          <w:tcPr>
+            <w:tcW w:type="dxa" w:w="2000"/>
+            <w:tcBorders>
+              <w:top w:val="single" w:color="B9C6E8" w:sz="6"/>
+              <w:left w:val="single" w:color="B9C6E8" w:sz="6"/>
+              <w:bottom w:val="single" w:color="B9C6E8" w:sz="6"/>
+              <w:right w:val="single" w:color="B9C6E8" w:sz="6"/>
+            </w:tcBorders>
+            <w:tcMar>
+              <w:top w:type="dxa" w:w="60"/>
+              <w:left w:type="dxa" w:w="110"/>
+              <w:bottom w:type="dxa" w:w="60"/>
+              <w:right w:type="dxa" w:w="110"/>
+            </w:tcMar>
+            <w:vAlign w:val="top"/>
+          </w:tcPr>
+          <w:p>
+            <w:pPr>
+              <w:spacing w:after="100" w:before="0"/>
+            </w:pPr>
+            <w:r>
+              <w:rPr>
+                <w:rFonts w:ascii="Calibri" w:cs="Calibri" w:eastAsia="Calibri" w:hAnsi="Calibri"/>
                 <w:color w:val="000000"/>
                 <w:sz w:val="22"/>
                 <w:szCs w:val="22"/>
               </w:rPr>
-              <w:t xml:space="preserve">20</w:t>
+              <w:t xml:space="preserve"/>
+            </w:r>
+          </w:p>
+        </w:tc>
+      </w:tr>
+      <w:tr>
+        <w:trPr>
+          <w:cantSplit/>
+          <w:trHeight w:val="280" w:hRule="atLeast"/>
+        </w:trPr>
+        <w:tc>
+          <w:tcPr>
+            <w:tcW w:type="dxa" w:w="3400"/>
+            <w:tcBorders>
+              <w:top w:val="single" w:color="B9C6E8" w:sz="6"/>
+              <w:left w:val="single" w:color="B9C6E8" w:sz="6"/>
+              <w:bottom w:val="single" w:color="B9C6E8" w:sz="6"/>
+              <w:right w:val="single" w:color="B9C6E8" w:sz="6"/>
+            </w:tcBorders>
+            <w:shd w:fill="F4F7FD" w:color="auto" w:val="clear"/>
+            <w:tcMar>
+              <w:top w:type="dxa" w:w="30"/>
+              <w:left w:type="dxa" w:w="110"/>
+              <w:bottom w:type="dxa" w:w="30"/>
+              <w:right w:type="dxa" w:w="110"/>
+            </w:tcMar>
+            <w:vAlign w:val="top"/>
+          </w:tcPr>
+          <w:p>
+            <w:pPr>
+              <w:spacing w:after="0" w:before="0"/>
+            </w:pPr>
+            <w:r>
+              <w:rPr>
+                <w:rFonts w:ascii="Calibri" w:cs="Calibri" w:eastAsia="Calibri" w:hAnsi="Calibri"/>
+                <w:b/>
+                <w:bCs/>
+                <w:color w:val="1E2761"/>
+                <w:sz w:val="19"/>
+                <w:szCs w:val="19"/>
+              </w:rPr>
+              <w:t xml:space="preserve">Rechtschreibung</w:t>
+            </w:r>
+          </w:p>
+        </w:tc>
+        <w:tc>
+          <w:tcPr>
+            <w:tcW w:type="dxa" w:w="7738"/>
+            <w:tcBorders>
+              <w:top w:val="single" w:color="B9C6E8" w:sz="6"/>
+              <w:left w:val="single" w:color="B9C6E8" w:sz="6"/>
+              <w:bottom w:val="single" w:color="B9C6E8" w:sz="6"/>
+              <w:right w:val="single" w:color="B9C6E8" w:sz="6"/>
+            </w:tcBorders>
+            <w:tcMar>
+              <w:top w:type="dxa" w:w="30"/>
+              <w:left w:type="dxa" w:w="110"/>
+              <w:bottom w:type="dxa" w:w="30"/>
+              <w:right w:type="dxa" w:w="110"/>
+            </w:tcMar>
+            <w:vAlign w:val="top"/>
+          </w:tcPr>
+          <w:p>
+            <w:pPr>
+              <w:spacing w:after="0" w:before="0"/>
+            </w:pPr>
+            <w:r>
+              <w:rPr>
+                <w:rFonts w:ascii="Calibri" w:cs="Calibri" w:eastAsia="Calibri" w:hAnsi="Calibri"/>
+                <w:color w:val="000000"/>
+                <w:sz w:val="17"/>
+                <w:szCs w:val="17"/>
+              </w:rPr>
+              <w:t xml:space="preserve">Korrekte Schreibung, auch Groß- und Kleinschreibung; Anredepronomen (du/ihr bzw. Sie) einheitlich.</w:t>
             </w:r>
           </w:p>
         </w:tc>
@@ -3878,7 +4241,41 @@
               <w:bottom w:val="single" w:color="B9C6E8" w:sz="6"/>
               <w:right w:val="single" w:color="B9C6E8" w:sz="6"/>
             </w:tcBorders>
-            <w:shd w:fill="EAF0FA" w:color="auto" w:val="clear"/>
+            <w:tcMar>
+              <w:top w:type="dxa" w:w="60"/>
+              <w:left w:type="dxa" w:w="110"/>
+              <w:bottom w:type="dxa" w:w="60"/>
+              <w:right w:type="dxa" w:w="110"/>
+            </w:tcMar>
+            <w:vAlign w:val="center"/>
+          </w:tcPr>
+          <w:p>
+            <w:pPr>
+              <w:spacing w:after="0" w:before="0"/>
+              <w:jc w:val="center"/>
+            </w:pPr>
+            <w:r>
+              <w:rPr>
+                <w:rFonts w:ascii="Calibri" w:cs="Calibri" w:eastAsia="Calibri" w:hAnsi="Calibri"/>
+                <w:b/>
+                <w:bCs/>
+                <w:color w:val="000000"/>
+                <w:sz w:val="21"/>
+                <w:szCs w:val="21"/>
+              </w:rPr>
+              <w:t xml:space="preserve">2</w:t>
+            </w:r>
+          </w:p>
+        </w:tc>
+        <w:tc>
+          <w:tcPr>
+            <w:tcW w:type="dxa" w:w="2000"/>
+            <w:tcBorders>
+              <w:top w:val="single" w:color="B9C6E8" w:sz="6"/>
+              <w:left w:val="single" w:color="B9C6E8" w:sz="6"/>
+              <w:bottom w:val="single" w:color="B9C6E8" w:sz="6"/>
+              <w:right w:val="single" w:color="B9C6E8" w:sz="6"/>
+            </w:tcBorders>
             <w:tcMar>
               <w:top w:type="dxa" w:w="60"/>
               <w:left w:type="dxa" w:w="110"/>
@@ -3903,7 +4300,590 @@
           </w:p>
         </w:tc>
       </w:tr>
+      <w:tr>
+        <w:trPr>
+          <w:cantSplit/>
+          <w:trHeight w:val="280" w:hRule="atLeast"/>
+        </w:trPr>
+        <w:tc>
+          <w:tcPr>
+            <w:tcW w:type="dxa" w:w="3400"/>
+            <w:tcBorders>
+              <w:top w:val="single" w:color="B9C6E8" w:sz="6"/>
+              <w:left w:val="single" w:color="B9C6E8" w:sz="6"/>
+              <w:bottom w:val="single" w:color="B9C6E8" w:sz="6"/>
+              <w:right w:val="single" w:color="B9C6E8" w:sz="6"/>
+            </w:tcBorders>
+            <w:shd w:fill="F4F7FD" w:color="auto" w:val="clear"/>
+            <w:tcMar>
+              <w:top w:type="dxa" w:w="30"/>
+              <w:left w:type="dxa" w:w="110"/>
+              <w:bottom w:type="dxa" w:w="30"/>
+              <w:right w:type="dxa" w:w="110"/>
+            </w:tcMar>
+            <w:vAlign w:val="top"/>
+          </w:tcPr>
+          <w:p>
+            <w:pPr>
+              <w:spacing w:after="0" w:before="0"/>
+            </w:pPr>
+            <w:r>
+              <w:rPr>
+                <w:rFonts w:ascii="Calibri" w:cs="Calibri" w:eastAsia="Calibri" w:hAnsi="Calibri"/>
+                <w:b/>
+                <w:bCs/>
+                <w:color w:val="1E2761"/>
+                <w:sz w:val="19"/>
+                <w:szCs w:val="19"/>
+              </w:rPr>
+              <w:t xml:space="preserve">Grammatik</w:t>
+            </w:r>
+          </w:p>
+        </w:tc>
+        <w:tc>
+          <w:tcPr>
+            <w:tcW w:type="dxa" w:w="7738"/>
+            <w:tcBorders>
+              <w:top w:val="single" w:color="B9C6E8" w:sz="6"/>
+              <w:left w:val="single" w:color="B9C6E8" w:sz="6"/>
+              <w:bottom w:val="single" w:color="B9C6E8" w:sz="6"/>
+              <w:right w:val="single" w:color="B9C6E8" w:sz="6"/>
+            </w:tcBorders>
+            <w:tcMar>
+              <w:top w:type="dxa" w:w="30"/>
+              <w:left w:type="dxa" w:w="110"/>
+              <w:bottom w:type="dxa" w:w="30"/>
+              <w:right w:type="dxa" w:w="110"/>
+            </w:tcMar>
+            <w:vAlign w:val="top"/>
+          </w:tcPr>
+          <w:p>
+            <w:pPr>
+              <w:spacing w:after="0" w:before="0"/>
+            </w:pPr>
+            <w:r>
+              <w:rPr>
+                <w:rFonts w:ascii="Calibri" w:cs="Calibri" w:eastAsia="Calibri" w:hAnsi="Calibri"/>
+                <w:color w:val="000000"/>
+                <w:sz w:val="17"/>
+                <w:szCs w:val="17"/>
+              </w:rPr>
+              <w:t xml:space="preserve">Korrekter Satzbau, Kasus, Tempus und Bezüge.</w:t>
+            </w:r>
+          </w:p>
+        </w:tc>
+        <w:tc>
+          <w:tcPr>
+            <w:tcW w:type="dxa" w:w="2000"/>
+            <w:tcBorders>
+              <w:top w:val="single" w:color="B9C6E8" w:sz="6"/>
+              <w:left w:val="single" w:color="B9C6E8" w:sz="6"/>
+              <w:bottom w:val="single" w:color="B9C6E8" w:sz="6"/>
+              <w:right w:val="single" w:color="B9C6E8" w:sz="6"/>
+            </w:tcBorders>
+            <w:tcMar>
+              <w:top w:type="dxa" w:w="60"/>
+              <w:left w:type="dxa" w:w="110"/>
+              <w:bottom w:type="dxa" w:w="60"/>
+              <w:right w:type="dxa" w:w="110"/>
+            </w:tcMar>
+            <w:vAlign w:val="center"/>
+          </w:tcPr>
+          <w:p>
+            <w:pPr>
+              <w:spacing w:after="0" w:before="0"/>
+              <w:jc w:val="center"/>
+            </w:pPr>
+            <w:r>
+              <w:rPr>
+                <w:rFonts w:ascii="Calibri" w:cs="Calibri" w:eastAsia="Calibri" w:hAnsi="Calibri"/>
+                <w:b/>
+                <w:bCs/>
+                <w:color w:val="000000"/>
+                <w:sz w:val="21"/>
+                <w:szCs w:val="21"/>
+              </w:rPr>
+              <w:t xml:space="preserve">2</w:t>
+            </w:r>
+          </w:p>
+        </w:tc>
+        <w:tc>
+          <w:tcPr>
+            <w:tcW w:type="dxa" w:w="2000"/>
+            <w:tcBorders>
+              <w:top w:val="single" w:color="B9C6E8" w:sz="6"/>
+              <w:left w:val="single" w:color="B9C6E8" w:sz="6"/>
+              <w:bottom w:val="single" w:color="B9C6E8" w:sz="6"/>
+              <w:right w:val="single" w:color="B9C6E8" w:sz="6"/>
+            </w:tcBorders>
+            <w:tcMar>
+              <w:top w:type="dxa" w:w="60"/>
+              <w:left w:type="dxa" w:w="110"/>
+              <w:bottom w:type="dxa" w:w="60"/>
+              <w:right w:type="dxa" w:w="110"/>
+            </w:tcMar>
+            <w:vAlign w:val="top"/>
+          </w:tcPr>
+          <w:p>
+            <w:pPr>
+              <w:spacing w:after="100" w:before="0"/>
+            </w:pPr>
+            <w:r>
+              <w:rPr>
+                <w:rFonts w:ascii="Calibri" w:cs="Calibri" w:eastAsia="Calibri" w:hAnsi="Calibri"/>
+                <w:color w:val="000000"/>
+                <w:sz w:val="22"/>
+                <w:szCs w:val="22"/>
+              </w:rPr>
+              <w:t xml:space="preserve"/>
+            </w:r>
+          </w:p>
+        </w:tc>
+      </w:tr>
+      <w:tr>
+        <w:trPr>
+          <w:cantSplit/>
+          <w:trHeight w:val="280" w:hRule="atLeast"/>
+        </w:trPr>
+        <w:tc>
+          <w:tcPr>
+            <w:tcW w:type="dxa" w:w="3400"/>
+            <w:tcBorders>
+              <w:top w:val="single" w:color="B9C6E8" w:sz="6"/>
+              <w:left w:val="single" w:color="B9C6E8" w:sz="6"/>
+              <w:bottom w:val="single" w:color="B9C6E8" w:sz="6"/>
+              <w:right w:val="single" w:color="B9C6E8" w:sz="6"/>
+            </w:tcBorders>
+            <w:shd w:fill="F4F7FD" w:color="auto" w:val="clear"/>
+            <w:tcMar>
+              <w:top w:type="dxa" w:w="30"/>
+              <w:left w:type="dxa" w:w="110"/>
+              <w:bottom w:type="dxa" w:w="30"/>
+              <w:right w:type="dxa" w:w="110"/>
+            </w:tcMar>
+            <w:vAlign w:val="top"/>
+          </w:tcPr>
+          <w:p>
+            <w:pPr>
+              <w:spacing w:after="0" w:before="0"/>
+            </w:pPr>
+            <w:r>
+              <w:rPr>
+                <w:rFonts w:ascii="Calibri" w:cs="Calibri" w:eastAsia="Calibri" w:hAnsi="Calibri"/>
+                <w:b/>
+                <w:bCs/>
+                <w:color w:val="1E2761"/>
+                <w:sz w:val="19"/>
+                <w:szCs w:val="19"/>
+              </w:rPr>
+              <w:t xml:space="preserve">Zeichensetzung</w:t>
+            </w:r>
+          </w:p>
+        </w:tc>
+        <w:tc>
+          <w:tcPr>
+            <w:tcW w:type="dxa" w:w="7738"/>
+            <w:tcBorders>
+              <w:top w:val="single" w:color="B9C6E8" w:sz="6"/>
+              <w:left w:val="single" w:color="B9C6E8" w:sz="6"/>
+              <w:bottom w:val="single" w:color="B9C6E8" w:sz="6"/>
+              <w:right w:val="single" w:color="B9C6E8" w:sz="6"/>
+            </w:tcBorders>
+            <w:tcMar>
+              <w:top w:type="dxa" w:w="30"/>
+              <w:left w:type="dxa" w:w="110"/>
+              <w:bottom w:type="dxa" w:w="30"/>
+              <w:right w:type="dxa" w:w="110"/>
+            </w:tcMar>
+            <w:vAlign w:val="top"/>
+          </w:tcPr>
+          <w:p>
+            <w:pPr>
+              <w:spacing w:after="0" w:before="0"/>
+            </w:pPr>
+            <w:r>
+              <w:rPr>
+                <w:rFonts w:ascii="Calibri" w:cs="Calibri" w:eastAsia="Calibri" w:hAnsi="Calibri"/>
+                <w:color w:val="000000"/>
+                <w:sz w:val="17"/>
+                <w:szCs w:val="17"/>
+              </w:rPr>
+              <w:t xml:space="preserve">Kommas (v. a. bei Nebensätzen und Anrede), Satzzeichen, Zeichen bei wörtlicher Rede.</w:t>
+            </w:r>
+          </w:p>
+        </w:tc>
+        <w:tc>
+          <w:tcPr>
+            <w:tcW w:type="dxa" w:w="2000"/>
+            <w:tcBorders>
+              <w:top w:val="single" w:color="B9C6E8" w:sz="6"/>
+              <w:left w:val="single" w:color="B9C6E8" w:sz="6"/>
+              <w:bottom w:val="single" w:color="B9C6E8" w:sz="6"/>
+              <w:right w:val="single" w:color="B9C6E8" w:sz="6"/>
+            </w:tcBorders>
+            <w:tcMar>
+              <w:top w:type="dxa" w:w="60"/>
+              <w:left w:type="dxa" w:w="110"/>
+              <w:bottom w:type="dxa" w:w="60"/>
+              <w:right w:type="dxa" w:w="110"/>
+            </w:tcMar>
+            <w:vAlign w:val="center"/>
+          </w:tcPr>
+          <w:p>
+            <w:pPr>
+              <w:spacing w:after="0" w:before="0"/>
+              <w:jc w:val="center"/>
+            </w:pPr>
+            <w:r>
+              <w:rPr>
+                <w:rFonts w:ascii="Calibri" w:cs="Calibri" w:eastAsia="Calibri" w:hAnsi="Calibri"/>
+                <w:b/>
+                <w:bCs/>
+                <w:color w:val="000000"/>
+                <w:sz w:val="21"/>
+                <w:szCs w:val="21"/>
+              </w:rPr>
+              <w:t xml:space="preserve">2</w:t>
+            </w:r>
+          </w:p>
+        </w:tc>
+        <w:tc>
+          <w:tcPr>
+            <w:tcW w:type="dxa" w:w="2000"/>
+            <w:tcBorders>
+              <w:top w:val="single" w:color="B9C6E8" w:sz="6"/>
+              <w:left w:val="single" w:color="B9C6E8" w:sz="6"/>
+              <w:bottom w:val="single" w:color="B9C6E8" w:sz="6"/>
+              <w:right w:val="single" w:color="B9C6E8" w:sz="6"/>
+            </w:tcBorders>
+            <w:tcMar>
+              <w:top w:type="dxa" w:w="60"/>
+              <w:left w:type="dxa" w:w="110"/>
+              <w:bottom w:type="dxa" w:w="60"/>
+              <w:right w:type="dxa" w:w="110"/>
+            </w:tcMar>
+            <w:vAlign w:val="top"/>
+          </w:tcPr>
+          <w:p>
+            <w:pPr>
+              <w:spacing w:after="100" w:before="0"/>
+            </w:pPr>
+            <w:r>
+              <w:rPr>
+                <w:rFonts w:ascii="Calibri" w:cs="Calibri" w:eastAsia="Calibri" w:hAnsi="Calibri"/>
+                <w:color w:val="000000"/>
+                <w:sz w:val="22"/>
+                <w:szCs w:val="22"/>
+              </w:rPr>
+              <w:t xml:space="preserve"/>
+            </w:r>
+          </w:p>
+        </w:tc>
+      </w:tr>
+      <w:tr>
+        <w:trPr>
+          <w:cantSplit/>
+          <w:trHeight w:val="320" w:hRule="atLeast"/>
+        </w:trPr>
+        <w:tc>
+          <w:tcPr>
+            <w:tcW w:type="dxa" w:w="3400"/>
+            <w:tcBorders>
+              <w:top w:val="single" w:color="B9C6E8" w:sz="6"/>
+              <w:left w:val="single" w:color="B9C6E8" w:sz="6"/>
+              <w:bottom w:val="single" w:color="B9C6E8" w:sz="6"/>
+              <w:right w:val="single" w:color="B9C6E8" w:sz="6"/>
+            </w:tcBorders>
+            <w:shd w:fill="EAF0FA" w:color="auto" w:val="clear"/>
+            <w:tcMar>
+              <w:top w:type="dxa" w:w="60"/>
+              <w:left w:type="dxa" w:w="110"/>
+              <w:bottom w:type="dxa" w:w="60"/>
+              <w:right w:type="dxa" w:w="110"/>
+            </w:tcMar>
+            <w:vAlign w:val="top"/>
+          </w:tcPr>
+          <w:p>
+            <w:pPr>
+              <w:spacing w:after="0" w:before="0"/>
+            </w:pPr>
+            <w:r>
+              <w:rPr>
+                <w:rFonts w:ascii="Calibri" w:cs="Calibri" w:eastAsia="Calibri" w:hAnsi="Calibri"/>
+                <w:b/>
+                <w:bCs/>
+                <w:color w:val="1E2761"/>
+                <w:sz w:val="19"/>
+                <w:szCs w:val="19"/>
+              </w:rPr>
+              <w:t xml:space="preserve">Summe Sprache</w:t>
+            </w:r>
+          </w:p>
+        </w:tc>
+        <w:tc>
+          <w:tcPr>
+            <w:tcW w:type="dxa" w:w="7738"/>
+            <w:tcBorders>
+              <w:top w:val="single" w:color="B9C6E8" w:sz="6"/>
+              <w:left w:val="single" w:color="B9C6E8" w:sz="6"/>
+              <w:bottom w:val="single" w:color="B9C6E8" w:sz="6"/>
+              <w:right w:val="single" w:color="B9C6E8" w:sz="6"/>
+            </w:tcBorders>
+            <w:shd w:fill="EAF0FA" w:color="auto" w:val="clear"/>
+            <w:tcMar>
+              <w:top w:type="dxa" w:w="60"/>
+              <w:left w:type="dxa" w:w="110"/>
+              <w:bottom w:type="dxa" w:w="60"/>
+              <w:right w:type="dxa" w:w="110"/>
+            </w:tcMar>
+            <w:vAlign w:val="top"/>
+          </w:tcPr>
+          <w:p>
+            <w:pPr>
+              <w:spacing w:after="100" w:before="0"/>
+            </w:pPr>
+            <w:r>
+              <w:rPr>
+                <w:rFonts w:ascii="Calibri" w:cs="Calibri" w:eastAsia="Calibri" w:hAnsi="Calibri"/>
+                <w:color w:val="000000"/>
+                <w:sz w:val="22"/>
+                <w:szCs w:val="22"/>
+              </w:rPr>
+              <w:t xml:space="preserve"/>
+            </w:r>
+          </w:p>
+        </w:tc>
+        <w:tc>
+          <w:tcPr>
+            <w:tcW w:type="dxa" w:w="2000"/>
+            <w:tcBorders>
+              <w:top w:val="single" w:color="B9C6E8" w:sz="6"/>
+              <w:left w:val="single" w:color="B9C6E8" w:sz="6"/>
+              <w:bottom w:val="single" w:color="B9C6E8" w:sz="6"/>
+              <w:right w:val="single" w:color="B9C6E8" w:sz="6"/>
+            </w:tcBorders>
+            <w:shd w:fill="EAF0FA" w:color="auto" w:val="clear"/>
+            <w:tcMar>
+              <w:top w:type="dxa" w:w="60"/>
+              <w:left w:type="dxa" w:w="110"/>
+              <w:bottom w:type="dxa" w:w="60"/>
+              <w:right w:type="dxa" w:w="110"/>
+            </w:tcMar>
+            <w:vAlign w:val="top"/>
+          </w:tcPr>
+          <w:p>
+            <w:pPr>
+              <w:spacing w:after="0" w:before="0"/>
+              <w:jc w:val="center"/>
+            </w:pPr>
+            <w:r>
+              <w:rPr>
+                <w:rFonts w:ascii="Calibri" w:cs="Calibri" w:eastAsia="Calibri" w:hAnsi="Calibri"/>
+                <w:b/>
+                <w:bCs/>
+                <w:color w:val="000000"/>
+                <w:sz w:val="21"/>
+                <w:szCs w:val="21"/>
+              </w:rPr>
+              <w:t xml:space="preserve">10</w:t>
+            </w:r>
+          </w:p>
+        </w:tc>
+        <w:tc>
+          <w:tcPr>
+            <w:tcW w:type="dxa" w:w="2000"/>
+            <w:tcBorders>
+              <w:top w:val="single" w:color="B9C6E8" w:sz="6"/>
+              <w:left w:val="single" w:color="B9C6E8" w:sz="6"/>
+              <w:bottom w:val="single" w:color="B9C6E8" w:sz="6"/>
+              <w:right w:val="single" w:color="B9C6E8" w:sz="6"/>
+            </w:tcBorders>
+            <w:shd w:fill="EAF0FA" w:color="auto" w:val="clear"/>
+            <w:tcMar>
+              <w:top w:type="dxa" w:w="60"/>
+              <w:left w:type="dxa" w:w="110"/>
+              <w:bottom w:type="dxa" w:w="60"/>
+              <w:right w:type="dxa" w:w="110"/>
+            </w:tcMar>
+            <w:vAlign w:val="top"/>
+          </w:tcPr>
+          <w:p>
+            <w:pPr>
+              <w:spacing w:after="100" w:before="0"/>
+            </w:pPr>
+            <w:r>
+              <w:rPr>
+                <w:rFonts w:ascii="Calibri" w:cs="Calibri" w:eastAsia="Calibri" w:hAnsi="Calibri"/>
+                <w:color w:val="000000"/>
+                <w:sz w:val="22"/>
+                <w:szCs w:val="22"/>
+              </w:rPr>
+              <w:t xml:space="preserve"/>
+            </w:r>
+          </w:p>
+        </w:tc>
+      </w:tr>
+      <w:tr>
+        <w:trPr>
+          <w:cantSplit/>
+          <w:trHeight w:val="320" w:hRule="atLeast"/>
+        </w:trPr>
+        <w:tc>
+          <w:tcPr>
+            <w:tcW w:type="dxa" w:w="3400"/>
+            <w:tcBorders>
+              <w:top w:val="single" w:color="B9C6E8" w:sz="6"/>
+              <w:left w:val="single" w:color="B9C6E8" w:sz="6"/>
+              <w:bottom w:val="single" w:color="B9C6E8" w:sz="6"/>
+              <w:right w:val="single" w:color="B9C6E8" w:sz="6"/>
+            </w:tcBorders>
+            <w:shd w:fill="D9E2F3" w:color="auto" w:val="clear"/>
+            <w:tcMar>
+              <w:top w:type="dxa" w:w="60"/>
+              <w:left w:type="dxa" w:w="110"/>
+              <w:bottom w:type="dxa" w:w="60"/>
+              <w:right w:type="dxa" w:w="110"/>
+            </w:tcMar>
+            <w:vAlign w:val="top"/>
+          </w:tcPr>
+          <w:p>
+            <w:pPr>
+              <w:spacing w:after="0" w:before="0"/>
+            </w:pPr>
+            <w:r>
+              <w:rPr>
+                <w:rFonts w:ascii="Calibri" w:cs="Calibri" w:eastAsia="Calibri" w:hAnsi="Calibri"/>
+                <w:b/>
+                <w:bCs/>
+                <w:color w:val="1E2761"/>
+                <w:sz w:val="19"/>
+                <w:szCs w:val="19"/>
+              </w:rPr>
+              <w:t xml:space="preserve">Gesamt (Inhalt + Sprache)</w:t>
+            </w:r>
+          </w:p>
+        </w:tc>
+        <w:tc>
+          <w:tcPr>
+            <w:tcW w:type="dxa" w:w="7738"/>
+            <w:tcBorders>
+              <w:top w:val="single" w:color="B9C6E8" w:sz="6"/>
+              <w:left w:val="single" w:color="B9C6E8" w:sz="6"/>
+              <w:bottom w:val="single" w:color="B9C6E8" w:sz="6"/>
+              <w:right w:val="single" w:color="B9C6E8" w:sz="6"/>
+            </w:tcBorders>
+            <w:shd w:fill="D9E2F3" w:color="auto" w:val="clear"/>
+            <w:tcMar>
+              <w:top w:type="dxa" w:w="60"/>
+              <w:left w:type="dxa" w:w="110"/>
+              <w:bottom w:type="dxa" w:w="60"/>
+              <w:right w:type="dxa" w:w="110"/>
+            </w:tcMar>
+            <w:vAlign w:val="top"/>
+          </w:tcPr>
+          <w:p>
+            <w:pPr>
+              <w:spacing w:after="100" w:before="0"/>
+            </w:pPr>
+            <w:r>
+              <w:rPr>
+                <w:rFonts w:ascii="Calibri" w:cs="Calibri" w:eastAsia="Calibri" w:hAnsi="Calibri"/>
+                <w:color w:val="000000"/>
+                <w:sz w:val="22"/>
+                <w:szCs w:val="22"/>
+              </w:rPr>
+              <w:t xml:space="preserve"/>
+            </w:r>
+          </w:p>
+        </w:tc>
+        <w:tc>
+          <w:tcPr>
+            <w:tcW w:type="dxa" w:w="2000"/>
+            <w:tcBorders>
+              <w:top w:val="single" w:color="B9C6E8" w:sz="6"/>
+              <w:left w:val="single" w:color="B9C6E8" w:sz="6"/>
+              <w:bottom w:val="single" w:color="B9C6E8" w:sz="6"/>
+              <w:right w:val="single" w:color="B9C6E8" w:sz="6"/>
+            </w:tcBorders>
+            <w:shd w:fill="D9E2F3" w:color="auto" w:val="clear"/>
+            <w:tcMar>
+              <w:top w:type="dxa" w:w="60"/>
+              <w:left w:type="dxa" w:w="110"/>
+              <w:bottom w:type="dxa" w:w="60"/>
+              <w:right w:type="dxa" w:w="110"/>
+            </w:tcMar>
+            <w:vAlign w:val="top"/>
+          </w:tcPr>
+          <w:p>
+            <w:pPr>
+              <w:spacing w:after="0" w:before="0"/>
+              <w:jc w:val="center"/>
+            </w:pPr>
+            <w:r>
+              <w:rPr>
+                <w:rFonts w:ascii="Calibri" w:cs="Calibri" w:eastAsia="Calibri" w:hAnsi="Calibri"/>
+                <w:b/>
+                <w:bCs/>
+                <w:color w:val="000000"/>
+                <w:sz w:val="21"/>
+                <w:szCs w:val="21"/>
+              </w:rPr>
+              <w:t xml:space="preserve">30</w:t>
+            </w:r>
+          </w:p>
+        </w:tc>
+        <w:tc>
+          <w:tcPr>
+            <w:tcW w:type="dxa" w:w="2000"/>
+            <w:tcBorders>
+              <w:top w:val="single" w:color="B9C6E8" w:sz="6"/>
+              <w:left w:val="single" w:color="B9C6E8" w:sz="6"/>
+              <w:bottom w:val="single" w:color="B9C6E8" w:sz="6"/>
+              <w:right w:val="single" w:color="B9C6E8" w:sz="6"/>
+            </w:tcBorders>
+            <w:shd w:fill="D9E2F3" w:color="auto" w:val="clear"/>
+            <w:tcMar>
+              <w:top w:type="dxa" w:w="60"/>
+              <w:left w:type="dxa" w:w="110"/>
+              <w:bottom w:type="dxa" w:w="60"/>
+              <w:right w:type="dxa" w:w="110"/>
+            </w:tcMar>
+            <w:vAlign w:val="top"/>
+          </w:tcPr>
+          <w:p>
+            <w:pPr>
+              <w:spacing w:after="100" w:before="0"/>
+            </w:pPr>
+            <w:r>
+              <w:rPr>
+                <w:rFonts w:ascii="Calibri" w:cs="Calibri" w:eastAsia="Calibri" w:hAnsi="Calibri"/>
+                <w:color w:val="000000"/>
+                <w:sz w:val="22"/>
+                <w:szCs w:val="22"/>
+              </w:rPr>
+              <w:t xml:space="preserve"/>
+            </w:r>
+          </w:p>
+        </w:tc>
+      </w:tr>
     </w:tbl>
+    <w:p>
+      <w:pPr>
+        <w:pageBreakBefore/>
+        <w:spacing w:after="20" w:before="0"/>
+      </w:pPr>
+      <w:r>
+        <w:rPr>
+          <w:rFonts w:ascii="Calibri" w:cs="Calibri" w:eastAsia="Calibri" w:hAnsi="Calibri"/>
+          <w:b/>
+          <w:bCs/>
+          <w:color w:val="5B6B8C"/>
+          <w:sz w:val="18"/>
+          <w:szCs w:val="18"/>
+        </w:rPr>
+        <w:t xml:space="preserve">TAFELSCRIPT · TRANSFER ⑥ · ERWARTUNGSHORIZONT</w:t>
+      </w:r>
+    </w:p>
     <w:p>
       <w:pPr>
         <w:keepNext/>
@@ -3929,7 +4909,7 @@
           <w:sz w:val="26"/>
           <w:szCs w:val="26"/>
         </w:rPr>
-        <w:t xml:space="preserve">Mögliche Formulierungen (Erwartungshorizont)</w:t>
+        <w:t xml:space="preserve">Mögliche Formulierungen im Brief</w:t>
       </w:r>
     </w:p>
     <w:p>
@@ -4043,7 +5023,7 @@
     <w:sectPr>
       <w:footerReference w:type="default" r:id="rId7"/>
       <w:pgSz w:w="16838" w:h="11906" w:orient="landscape"/>
-      <w:pgMar w:top="700" w:right="850" w:bottom="700" w:left="850" w:header="708" w:footer="350" w:gutter="0"/>
+      <w:pgMar w:top="600" w:right="850" w:bottom="600" w:left="850" w:header="708" w:footer="350" w:gutter="0"/>
       <w:pgNumType/>
       <w:docGrid w:linePitch="360"/>
     </w:sectPr>

</xml_diff>